<commit_message>
Add initial draft of COD fee collection process document
</commit_message>
<xml_diff>
--- a/02.FINAL_SPACE/FINAL_PROCESS/Quy trình thu phí COD/Quy Trình Thu Phí COD.docx
+++ b/02.FINAL_SPACE/FINAL_PROCESS/Quy trình thu phí COD/Quy Trình Thu Phí COD.docx
@@ -17978,13 +17978,17 @@
           <w:p>
             <w:pPr>
               <w:jc w:val="both"/>
-            </w:pPr>
-            <w:r>
-              <w:rPr>
-                <w:sz w:val="18"/>
-                <w:szCs w:val="18"/>
-              </w:rPr>
-              <w:t>Bưu tá</w:t>
+              <w:rPr>
+                <w:sz w:val="18"/>
+                <w:szCs w:val="18"/>
+              </w:rPr>
+            </w:pPr>
+            <w:r>
+              <w:rPr>
+                <w:sz w:val="18"/>
+                <w:szCs w:val="18"/>
+              </w:rPr>
+              <w:t>Người giao hàng</w:t>
             </w:r>
           </w:p>
         </w:tc>
@@ -42212,6 +42216,7 @@
   <w:style w:type="character" w:default="1" w:styleId="DefaultParagraphFont">
     <w:name w:val="Default Paragraph Font"/>
     <w:uiPriority w:val="1"/>
+    <w:semiHidden/>
     <w:unhideWhenUsed/>
   </w:style>
   <w:style w:type="table" w:default="1" w:styleId="TableNormal">

</xml_diff>